<commit_message>
docs: atualizando documentação e adicionando documento sobre o Slack
</commit_message>
<xml_diff>
--- a/Documentação/StreamGuard_Documentacao.docx
+++ b/Documentação/StreamGuard_Documentacao.docx
@@ -1250,6 +1250,7 @@
           <w:b/>
           <w:bCs/>
           <w:color w:val="0e2841"/>
+          <w:highlight w:val="none"/>
         </w:rPr>
       </w:pPr>
       <w:r>
@@ -1258,7 +1259,7 @@
           <w:bCs/>
           <w:color w:val="0e2841"/>
         </w:rPr>
-        <w:t xml:space="preserve">Diagrama de Requisitos – Backlog</w:t>
+        <w:t xml:space="preserve">9. Diagrama de Requisitos – Backlog</w:t>
       </w:r>
       <w:r>
         <w:rPr>
@@ -1266,7 +1267,29 @@
           <w:bCs/>
           <w:color w:val="0e2841"/>
         </w:rPr>
+      </w:r>
+      <w:r>
+        <w:rPr>
+          <w:b/>
+          <w:bCs/>
+          <w:color w:val="0e2841"/>
+        </w:rPr>
+      </w:r>
+      <w:r>
+        <w:rPr>
+          <w:b/>
+          <w:bCs/>
+          <w:color w:val="0e2841"/>
+        </w:rPr>
         <w:tab/>
+      </w:r>
+      <w:r/>
+      <w:r>
+        <w:rPr>
+          <w:b/>
+          <w:bCs/>
+          <w:color w:val="0e2841"/>
+        </w:rPr>
         <w:t xml:space="preserve">7</w:t>
       </w:r>
       <w:r>
@@ -1303,16 +1326,50 @@
           <w:b/>
           <w:bCs/>
           <w:color w:val="0e2841"/>
-        </w:rPr>
-        <w:t xml:space="preserve">Considerações Finais</w:t>
+          <w:highlight w:val="none"/>
+        </w:rPr>
+        <w:t xml:space="preserve">10. Gr</w:t>
       </w:r>
       <w:r>
         <w:rPr>
           <w:b/>
           <w:bCs/>
           <w:color w:val="0e2841"/>
+          <w:highlight w:val="none"/>
+        </w:rPr>
+        <w:t xml:space="preserve">áfico de Burndown</w:t>
+      </w:r>
+      <w:r>
+        <w:rPr>
+          <w:b/>
+          <w:bCs/>
+          <w:color w:val="0e2841"/>
+        </w:rPr>
+      </w:r>
+      <w:r>
+        <w:rPr>
+          <w:b/>
+          <w:bCs/>
+          <w:color w:val="0e2841"/>
         </w:rPr>
         <w:tab/>
+      </w:r>
+      <w:r/>
+      <w:r>
+        <w:rPr>
+          <w:b/>
+          <w:bCs/>
+          <w:color w:val="0e2841"/>
+          <w:highlight w:val="none"/>
+        </w:rPr>
+      </w:r>
+      <w:r>
+        <w:rPr>
+          <w:b/>
+          <w:bCs/>
+          <w:color w:val="0e2841"/>
+          <w:highlight w:val="none"/>
+        </w:rPr>
         <w:t xml:space="preserve">7</w:t>
       </w:r>
       <w:r>
@@ -1320,13 +1377,7 @@
           <w:b/>
           <w:bCs/>
           <w:color w:val="0e2841"/>
-        </w:rPr>
-      </w:r>
-      <w:r>
-        <w:rPr>
-          <w:b/>
-          <w:bCs/>
-          <w:color w:val="0e2841"/>
+          <w:highlight w:val="none"/>
         </w:rPr>
       </w:r>
     </w:p>
@@ -1350,7 +1401,7 @@
           <w:bCs/>
           <w:color w:val="0e2841"/>
         </w:rPr>
-        <w:t xml:space="preserve">Referências Bibliográficas</w:t>
+        <w:t xml:space="preserve">11. Considerações Finais</w:t>
       </w:r>
       <w:r>
         <w:rPr>
@@ -1358,8 +1409,98 @@
           <w:bCs/>
           <w:color w:val="0e2841"/>
         </w:rPr>
+      </w:r>
+      <w:r>
+        <w:rPr>
+          <w:b/>
+          <w:bCs/>
+          <w:color w:val="0e2841"/>
+        </w:rPr>
+      </w:r>
+      <w:r>
+        <w:rPr>
+          <w:b/>
+          <w:bCs/>
+          <w:color w:val="0e2841"/>
+        </w:rPr>
         <w:tab/>
+      </w:r>
+      <w:r/>
+      <w:r>
+        <w:rPr>
+          <w:b/>
+          <w:bCs/>
+          <w:color w:val="0e2841"/>
+        </w:rPr>
         <w:t xml:space="preserve">7</w:t>
+      </w:r>
+      <w:r>
+        <w:rPr>
+          <w:b/>
+          <w:bCs/>
+          <w:color w:val="0e2841"/>
+        </w:rPr>
+      </w:r>
+      <w:r>
+        <w:rPr>
+          <w:b/>
+          <w:bCs/>
+          <w:color w:val="0e2841"/>
+        </w:rPr>
+      </w:r>
+    </w:p>
+    <w:p>
+      <w:pPr>
+        <w:pBdr/>
+        <w:tabs>
+          <w:tab w:val="right" w:leader="dot" w:pos="9026"/>
+        </w:tabs>
+        <w:spacing w:after="60"/>
+        <w:ind w:left="0"/>
+        <w:rPr>
+          <w:b/>
+          <w:bCs/>
+          <w:color w:val="0e2841"/>
+        </w:rPr>
+      </w:pPr>
+      <w:r>
+        <w:rPr>
+          <w:b/>
+          <w:bCs/>
+          <w:color w:val="0e2841"/>
+        </w:rPr>
+        <w:t xml:space="preserve">12. Referências Bibliográficas</w:t>
+      </w:r>
+      <w:r>
+        <w:rPr>
+          <w:b/>
+          <w:bCs/>
+          <w:color w:val="0e2841"/>
+        </w:rPr>
+      </w:r>
+      <w:r>
+        <w:rPr>
+          <w:b/>
+          <w:bCs/>
+          <w:color w:val="0e2841"/>
+        </w:rPr>
+        <w:tab/>
+      </w:r>
+      <w:r/>
+      <w:r>
+        <w:rPr>
+          <w:b/>
+          <w:bCs/>
+          <w:color w:val="0e2841"/>
+        </w:rPr>
+      </w:r>
+      <w:r>
+        <w:rPr>
+          <w:b/>
+          <w:bCs/>
+          <w:color w:val="0e2841"/>
+        </w:rPr>
+        <w:t xml:space="preserve">8</w:t>
       </w:r>
       <w:r>
         <w:rPr>
@@ -3245,7 +3386,7 @@
           <w:color w:val="0e2841" w:themeColor="text2"/>
           <w:lang w:val="pt-BR"/>
         </w:rPr>
-        <w:t xml:space="preserve">Diagrama de Requisitos</w:t>
+        <w:t xml:space="preserve">9. Diagrama de Requisitos</w:t>
       </w:r>
       <w:r>
         <w:rPr>
@@ -3272,52 +3413,57 @@
         <w:ind/>
         <w:jc w:val="both"/>
         <w:rPr>
+          <w:highlight w:val="none"/>
+        </w:rPr>
+      </w:pPr>
+      <w:r>
+        <w:rPr>
+          <w:color w:val="4b4b4b"/>
+          <w:lang w:val="en"/>
+        </w:rPr>
+        <w:t xml:space="preserve">O backlog do projeto consiste em uma lista organizada contendo todas as funcionalidades, requisitos, melhorias e tarefas necessárias para o desenvolvimento do sistema </w:t>
+      </w:r>
+      <w:r>
+        <w:rPr>
+          <w:color w:val="4b4b4b"/>
+          <w:lang w:val="pt-BR"/>
+        </w:rPr>
+        <w:t xml:space="preserve">StreamGuard</w:t>
+      </w:r>
+      <w:r>
+        <w:rPr>
+          <w:color w:val="4b4b4b"/>
+          <w:lang w:val="en"/>
+        </w:rPr>
+        <w:t xml:space="preserve">. Sua principal</w:t>
+      </w:r>
+      <w:r>
+        <w:rPr>
+          <w:color w:val="4b4b4b"/>
+          <w:lang w:val="en"/>
+        </w:rPr>
+        <w:t xml:space="preserve"> finalidade é auxiliar no planejamento das atividades da equipe, permitindo a priorização das funcionalidades mais importantes para cada etapa do projeto. Para o gerenciamento do backlog, foram utilizadas ferramentas como planilhas no Excel e a plataforma </w:t>
+      </w:r>
+      <w:r>
+        <w:rPr>
+          <w:color w:val="4b4b4b"/>
+          <w:lang w:val="pt-BR"/>
+        </w:rPr>
+        <w:t xml:space="preserve">Planner</w:t>
+      </w:r>
+      <w:r>
+        <w:rPr>
+          <w:color w:val="4b4b4b"/>
+          <w:lang w:val="en"/>
+        </w:rPr>
+        <w:t xml:space="preserve">.</w:t>
+      </w:r>
+      <w:r>
+        <w:rPr>
           <w:color w:val="4b4b4b"/>
           <w:highlight w:val="none"/>
           <w:lang w:val="en"/>
         </w:rPr>
-      </w:pPr>
-      <w:r>
-        <w:rPr>
-          <w:color w:val="4b4b4b"/>
-          <w:lang w:val="en"/>
-        </w:rPr>
-        <w:t xml:space="preserve">O backlog do projeto consiste em uma lista organizada contendo todas as funcionalidades, requisitos, melhorias e tarefas necessárias para o desenvolvimento do sistema </w:t>
-      </w:r>
-      <w:r>
-        <w:rPr>
-          <w:color w:val="4b4b4b"/>
-          <w:lang w:val="pt-BR"/>
-        </w:rPr>
-        <w:t xml:space="preserve">StreamGuard</w:t>
-      </w:r>
-      <w:r>
-        <w:rPr>
-          <w:color w:val="4b4b4b"/>
-          <w:lang w:val="en"/>
-        </w:rPr>
-        <w:t xml:space="preserve">. Sua principal</w:t>
-      </w:r>
-      <w:r>
-        <w:rPr>
-          <w:color w:val="4b4b4b"/>
-          <w:lang w:val="en"/>
-        </w:rPr>
-        <w:t xml:space="preserve"> finalidade é auxiliar no planejamento das atividades da equipe, permitindo a priorização das funcionalidades mais importantes para cada etapa do projeto. Para o gerenciamento do backlog, foram utilizadas ferramentas como planilhas no Excel e a plataforma </w:t>
-      </w:r>
-      <w:r>
-        <w:rPr>
-          <w:color w:val="4b4b4b"/>
-          <w:lang w:val="pt-BR"/>
-        </w:rPr>
-        <w:t xml:space="preserve">Planner</w:t>
-      </w:r>
-      <w:r>
-        <w:rPr>
-          <w:color w:val="4b4b4b"/>
-          <w:lang w:val="en"/>
-        </w:rPr>
-        <w:t xml:space="preserve">.</w:t>
       </w:r>
       <w:r>
         <w:rPr>
@@ -3326,6 +3472,8 @@
           <w:lang w:val="en"/>
         </w:rPr>
       </w:r>
+      <w:r/>
+      <w:r/>
       <w:r>
         <w:rPr>
           <w:color w:val="4b4b4b"/>
@@ -3342,72 +3490,31 @@
         <w:jc w:val="both"/>
         <w:rPr>
           <w:color w:val="4b4b4b"/>
-          <w:lang w:val="en-US"/>
+          <w:highlight w:val="none"/>
+          <w:lang w:val="en"/>
         </w:rPr>
       </w:pPr>
       <w:r>
         <w:rPr>
           <w:color w:val="4b4b4b"/>
-          <w:lang w:val="en-US"/>
+          <w:highlight w:val="none"/>
+          <w:lang w:val="en"/>
         </w:rPr>
       </w:r>
       <w:r>
         <w:rPr>
           <w:color w:val="4b4b4b"/>
-          <w:lang w:val="en-US"/>
+          <w:highlight w:val="none"/>
+          <w:lang w:val="en"/>
         </w:rPr>
       </w:r>
       <w:r>
         <w:rPr>
           <w:color w:val="4b4b4b"/>
-          <w:lang w:val="en-US"/>
+          <w:highlight w:val="none"/>
+          <w:lang w:val="en"/>
         </w:rPr>
       </w:r>
-    </w:p>
-    <w:p>
-      <w:pPr>
-        <w:pBdr/>
-        <w:spacing/>
-        <w:ind/>
-        <w:jc w:val="both"/>
-        <w:rPr>
-          <w:color w:val="4b4b4b"/>
-          <w:highlight w:val="none"/>
-          <w:lang w:val="pt-BR"/>
-        </w:rPr>
-      </w:pPr>
-      <w:r>
-        <w:rPr>
-          <w:color w:val="4b4b4b"/>
-          <w:highlight w:val="none"/>
-          <w:lang w:val="pt-BR"/>
-        </w:rPr>
-        <w:t xml:space="preserve">(ScreenShot do Excel)</w:t>
-      </w:r>
-      <w:r>
-        <w:rPr>
-          <w:color w:val="4b4b4b"/>
-          <w:highlight w:val="none"/>
-          <w:lang w:val="pt-BR"/>
-        </w:rPr>
-      </w:r>
-      <w:r>
-        <w:rPr>
-          <w:color w:val="4b4b4b"/>
-          <w:highlight w:val="none"/>
-          <w:lang w:val="pt-BR"/>
-        </w:rPr>
-      </w:r>
-    </w:p>
-    <w:p>
-      <w:pPr>
-        <w:pBdr/>
-        <w:spacing w:after="80" w:before="80"/>
-        <w:ind/>
-        <w:rPr/>
-      </w:pPr>
-      <w:r/>
-      <w:r/>
     </w:p>
     <w:p>
       <w:pPr>
@@ -3424,106 +3531,262 @@
         <w:ind/>
         <w:rPr>
           <w:color w:val="0e2841" w:themeColor="text2"/>
+          <w:highlight w:val="none"/>
+          <w14:ligatures w14:val="none"/>
         </w:rPr>
       </w:pPr>
       <w:r>
         <w:rPr>
           <w:color w:val="0e2841" w:themeColor="text2"/>
-        </w:rPr>
-        <w:t xml:space="preserve">Considerações Finais</w:t>
+          <w:lang w:val="pt-BR" w:bidi="pt-BR"/>
+        </w:rPr>
       </w:r>
       <w:r>
         <w:rPr>
           <w:color w:val="0e2841" w:themeColor="text2"/>
-        </w:rPr>
+          <w:lang w:val="pt-BR"/>
+        </w:rPr>
+        <w:t xml:space="preserve">10. Gr</w:t>
       </w:r>
       <w:r>
         <w:rPr>
           <w:color w:val="0e2841" w:themeColor="text2"/>
+          <w:lang w:val="pt-BR"/>
+        </w:rPr>
+        <w:t xml:space="preserve">áfico de </w:t>
+      </w:r>
+      <w:r>
+        <w:rPr>
+          <w:color w:val="0e2841" w:themeColor="text2"/>
+          <w:lang w:val="pt-BR"/>
+        </w:rPr>
+        <w:t xml:space="preserve">Burndown</w:t>
+      </w:r>
+      <w:r>
+        <w:rPr>
+          <w:color w:val="0e2841" w:themeColor="text2"/>
+          <w:lang w:val="pt-BR"/>
         </w:rPr>
       </w:r>
     </w:p>
     <w:p>
       <w:pPr>
-        <w:pBdr/>
-        <w:spacing w:after="120" w:before="80" w:line="276" w:lineRule="auto"/>
+        <w:pBdr>
+          <w:top w:val="none" w:color="000000" w:sz="4" w:space="0"/>
+          <w:left w:val="none" w:color="000000" w:sz="4" w:space="0"/>
+          <w:bottom w:val="single" w:color="0e2841" w:themeColor="text2" w:sz="4" w:space="0"/>
+          <w:right w:val="none" w:color="000000" w:sz="4" w:space="0"/>
+          <w:between w:val="none" w:color="000000" w:sz="4" w:space="0"/>
+        </w:pBdr>
+        <w:spacing/>
         <w:ind/>
         <w:jc w:val="both"/>
         <w:rPr>
           <w:color w:val="4b4b4b"/>
+          <w:highlight w:val="none"/>
+          <w:lang w:val="pt-BR"/>
+          <w14:ligatures w14:val="none"/>
         </w:rPr>
       </w:pPr>
       <w:r>
         <w:rPr>
           <w:color w:val="4b4b4b"/>
-        </w:rPr>
-        <w:t xml:space="preserve">O StreamGuard</w:t>
+          <w:lang w:val="pt-BR"/>
+        </w:rPr>
+        <w:t xml:space="preserve">O burndown foi desenvolvido para melhor controle do andamento do projeto, </w:t>
       </w:r>
       <w:r>
         <w:rPr>
           <w:color w:val="4b4b4b"/>
-        </w:rPr>
-        <w:t xml:space="preserve"> nasce da constatação de que picos de audiência em grandes eventos ao vivo, como observado durante a Copa do Mundo de 2026, expõem fragilidades de infraestrutura que impactam diretamente a experiência do espectador, a receita publicitária e a confiança do </w:t>
+          <w:lang w:val="pt-BR"/>
+        </w:rPr>
+        <w:t xml:space="preserve">é onde s</w:t>
       </w:r>
       <w:r>
         <w:rPr>
           <w:color w:val="4b4b4b"/>
-        </w:rPr>
-        <w:t xml:space="preserve">público na plataforma. Ao propor um painel automatizado de monitoramento, capaz de antecipar sinais de sobrecarga antes que afetem a transmissão, o projeto busca transformar uma atuação hoje reativa em uma atuação preventiva por parte das equipes técnicas.</w:t>
+          <w:lang w:val="pt-BR"/>
+        </w:rPr>
+        <w:t xml:space="preserve">ão registradas os pontos entregues baseados na sequ</w:t>
       </w:r>
       <w:r>
         <w:rPr>
           <w:color w:val="4b4b4b"/>
-        </w:rPr>
+          <w:lang w:val="pt-BR"/>
+        </w:rPr>
+        <w:t xml:space="preserve">ência de fibonacci, eles s</w:t>
       </w:r>
       <w:r>
         <w:rPr>
           <w:color w:val="4b4b4b"/>
+          <w:lang w:val="pt-BR"/>
+        </w:rPr>
+        <w:t xml:space="preserve">ão adicionados em uma tabela, e para melhor visualizaç</w:t>
+      </w:r>
+      <w:r>
+        <w:rPr>
+          <w:color w:val="4b4b4b"/>
+          <w:lang w:val="pt-BR"/>
+        </w:rPr>
+        <w:t xml:space="preserve">ão, h</w:t>
+      </w:r>
+      <w:r>
+        <w:rPr>
+          <w:color w:val="4b4b4b"/>
+          <w:lang w:val="pt-BR"/>
+        </w:rPr>
+        <w:t xml:space="preserve">á o gr</w:t>
+      </w:r>
+      <w:r>
+        <w:rPr>
+          <w:color w:val="4b4b4b"/>
+          <w:lang w:val="pt-BR"/>
+        </w:rPr>
+        <w:t xml:space="preserve">áfico de burndown, onde esses registros s</w:t>
+      </w:r>
+      <w:r>
+        <w:rPr>
+          <w:color w:val="4b4b4b"/>
+          <w:lang w:val="pt-BR"/>
+        </w:rPr>
+        <w:t xml:space="preserve">ão refletidos de forma visual, tendo assim um melhor entendimento de como est</w:t>
+      </w:r>
+      <w:r>
+        <w:rPr>
+          <w:color w:val="4b4b4b"/>
+          <w:lang w:val="pt-BR"/>
+        </w:rPr>
+        <w:t xml:space="preserve">á a evoluç</w:t>
+      </w:r>
+      <w:r>
+        <w:rPr>
+          <w:color w:val="4b4b4b"/>
+          <w:lang w:val="pt-BR"/>
+        </w:rPr>
+        <w:t xml:space="preserve">ão do sistema a cada dia.</w:t>
+      </w:r>
+      <w:r>
+        <w:rPr>
+          <w:color w:val="4b4b4b"/>
+          <w:lang w:val="en"/>
         </w:rPr>
       </w:r>
     </w:p>
     <w:p>
       <w:pPr>
-        <w:pBdr/>
-        <w:spacing w:after="120" w:before="80" w:line="276" w:lineRule="auto"/>
+        <w:pBdr>
+          <w:top w:val="none" w:color="000000" w:sz="4" w:space="0"/>
+          <w:left w:val="none" w:color="000000" w:sz="4" w:space="0"/>
+          <w:bottom w:val="single" w:color="0e2841" w:themeColor="text2" w:sz="4" w:space="0"/>
+          <w:right w:val="none" w:color="000000" w:sz="4" w:space="0"/>
+          <w:between w:val="none" w:color="000000" w:sz="4" w:space="0"/>
+        </w:pBdr>
+        <w:spacing/>
         <w:ind/>
         <w:jc w:val="both"/>
         <w:rPr>
           <w:color w:val="4b4b4b"/>
+          <w:lang w:val="en"/>
+          <w14:ligatures w14:val="none"/>
         </w:rPr>
       </w:pPr>
       <w:r>
         <w:rPr>
           <w:color w:val="4b4b4b"/>
-        </w:rPr>
-        <w:t xml:space="preserve">Para as próximas sprints, a equipe seguirá o cronograma definido, com foco n</w:t>
+          <w:highlight w:val="none"/>
+          <w:lang w:val="en" w:bidi="en"/>
+        </w:rPr>
       </w:r>
       <w:r>
         <w:rPr>
           <w:color w:val="4b4b4b"/>
-        </w:rPr>
-        <w:t xml:space="preserve">o desenvolvimento da aplicação, na preparação da infraestrutura e, posteriormente, nos ajustes finais e no deploy em produção, mantendo como fio condutor o compromisso, a participação ativa e a melhoria contínua estabelecidos como boas práticas do projeto.</w:t>
+          <w:highlight w:val="none"/>
+          <w:lang w:val="en" w:bidi="en"/>
+        </w:rPr>
       </w:r>
       <w:r>
-        <w:rPr>
-          <w:color w:val="4b4b4b"/>
-        </w:rPr>
+        <mc:AlternateContent>
+          <mc:Choice Requires="wpg">
+            <w:drawing>
+              <wp:inline xmlns:wp="http://schemas.openxmlformats.org/drawingml/2006/wordprocessingDrawing" distT="0" distB="0" distL="0" distR="0">
+                <wp:extent cx="5731510" cy="3781773"/>
+                <wp:effectExtent l="0" t="0" r="0" b="0"/>
+                <wp:docPr id="1" name=""/>
+                <wp:cNvGraphicFramePr>
+                  <a:graphicFrameLocks xmlns:a="http://schemas.openxmlformats.org/drawingml/2006/main" noChangeAspect="1"/>
+                </wp:cNvGraphicFramePr>
+                <a:graphic xmlns:a="http://schemas.openxmlformats.org/drawingml/2006/main">
+                  <a:graphicData uri="http://schemas.openxmlformats.org/drawingml/2006/picture">
+                    <pic:pic xmlns:pic="http://schemas.openxmlformats.org/drawingml/2006/picture">
+                      <pic:nvPicPr>
+                        <pic:cNvPr id="1601395577" name=""/>
+                        <pic:cNvPicPr>
+                          <a:picLocks noChangeAspect="1"/>
+                        </pic:cNvPicPr>
+                        <pic:nvPr/>
+                      </pic:nvPicPr>
+                      <pic:blipFill rotWithShape="1">
+                        <a:blip r:embed="rId11"/>
+                        <a:stretch/>
+                      </pic:blipFill>
+                      <pic:spPr bwMode="auto">
+                        <a:xfrm>
+                          <a:off x="0" y="0"/>
+                          <a:ext cx="5731509" cy="3781773"/>
+                        </a:xfrm>
+                        <a:prstGeom prst="rect">
+                          <a:avLst/>
+                        </a:prstGeom>
+                      </pic:spPr>
+                    </pic:pic>
+                  </a:graphicData>
+                </a:graphic>
+              </wp:inline>
+            </w:drawing>
+          </mc:Choice>
+          <mc:Fallback>
+            <w:pict>
+              <v:shapetype id="_x0000_t75" coordsize="21600,21600" o:spt="75" o:preferrelative="t" path="m@4@5l@4@11@9@11@9@5xe" filled="f" stroked="f">
+                <v:stroke joinstyle="miter"/>
+                <v:formulas>
+                  <v:f eqn="if lineDrawn pixelLineWidth 0"/>
+                  <v:f eqn="sum @0 1 0"/>
+                  <v:f eqn="sum 0 0 @1"/>
+                  <v:f eqn="prod @2 1 2"/>
+                  <v:f eqn="prod @3 21600 pixelWidth"/>
+                  <v:f eqn="prod @3 21600 pixelHeight"/>
+                  <v:f eqn="sum @0 0 1"/>
+                  <v:f eqn="prod @6 1 2"/>
+                  <v:f eqn="prod @7 21600 pixelWidth"/>
+                  <v:f eqn="sum @8 21600 0"/>
+                  <v:f eqn="prod @7 21600 pixelHeight"/>
+                  <v:f eqn="sum @10 21600 0"/>
+                </v:formulas>
+                <v:path o:extrusionok="f" gradientshapeok="t" o:connecttype="rect"/>
+                <o:lock v:ext="edit" aspectratio="t"/>
+              </v:shapetype>
+              <v:shape id="_x0000_i0" o:spid="_x0000_s0" type="#_x0000_t75" style="width:451.30pt;height:297.78pt;mso-wrap-distance-left:0.00pt;mso-wrap-distance-top:0.00pt;mso-wrap-distance-right:0.00pt;mso-wrap-distance-bottom:0.00pt;z-index:1;" stroked="false">
+                <v:imagedata r:id="rId11" o:title=""/>
+                <o:lock v:ext="edit" rotation="t"/>
+              </v:shape>
+            </w:pict>
+          </mc:Fallback>
+        </mc:AlternateContent>
       </w:r>
       <w:r>
         <w:rPr>
           <w:color w:val="4b4b4b"/>
+          <w:highlight w:val="none"/>
+          <w:lang w:val="en" w:bidi="en"/>
         </w:rPr>
       </w:r>
-    </w:p>
-    <w:p>
-      <w:pPr>
-        <w:pBdr/>
-        <w:spacing/>
-        <w:ind/>
-        <w:rPr/>
-      </w:pPr>
-      <w:r/>
-      <w:r/>
+      <w:r>
+        <w:rPr>
+          <w:color w:val="4b4b4b"/>
+          <w:highlight w:val="none"/>
+          <w:lang w:val="en"/>
+        </w:rPr>
+      </w:r>
     </w:p>
     <w:p>
       <w:pPr>
@@ -3546,7 +3809,123 @@
         <w:rPr>
           <w:color w:val="0e2841" w:themeColor="text2"/>
         </w:rPr>
-        <w:t xml:space="preserve">Referências Bibliográficas</w:t>
+        <w:t xml:space="preserve">11. Considerações Finais</w:t>
+      </w:r>
+      <w:r>
+        <w:rPr>
+          <w:color w:val="0e2841" w:themeColor="text2"/>
+        </w:rPr>
+      </w:r>
+      <w:r>
+        <w:rPr>
+          <w:color w:val="0e2841" w:themeColor="text2"/>
+        </w:rPr>
+      </w:r>
+    </w:p>
+    <w:p>
+      <w:pPr>
+        <w:pBdr/>
+        <w:spacing w:after="120" w:before="80" w:line="276" w:lineRule="auto"/>
+        <w:ind/>
+        <w:jc w:val="both"/>
+        <w:rPr>
+          <w:color w:val="4b4b4b"/>
+        </w:rPr>
+      </w:pPr>
+      <w:r>
+        <w:rPr>
+          <w:color w:val="4b4b4b"/>
+        </w:rPr>
+        <w:t xml:space="preserve">O StreamGuard</w:t>
+      </w:r>
+      <w:r>
+        <w:rPr>
+          <w:color w:val="4b4b4b"/>
+        </w:rPr>
+        <w:t xml:space="preserve"> nasce da constatação de que picos de audiência em grandes eventos ao vivo, como observado durante a Copa do Mundo de 2026, expõem fragilidades de infraestrutura que impactam diretamente a experiência do espectador, a receita publicitária e a confiança do </w:t>
+      </w:r>
+      <w:r>
+        <w:rPr>
+          <w:color w:val="4b4b4b"/>
+        </w:rPr>
+        <w:t xml:space="preserve">público na plataforma. Ao propor um painel automatizado de monitoramento, capaz de antecipar sinais de sobrecarga antes que afetem a transmissão, o projeto busca transformar uma atuação hoje reativa em uma atuação preventiva por parte das equipes técnicas.</w:t>
+      </w:r>
+      <w:r>
+        <w:rPr>
+          <w:color w:val="4b4b4b"/>
+        </w:rPr>
+      </w:r>
+      <w:r>
+        <w:rPr>
+          <w:color w:val="4b4b4b"/>
+        </w:rPr>
+      </w:r>
+    </w:p>
+    <w:p>
+      <w:pPr>
+        <w:pBdr/>
+        <w:spacing w:after="120" w:before="80" w:line="276" w:lineRule="auto"/>
+        <w:ind/>
+        <w:jc w:val="both"/>
+        <w:rPr>
+          <w:color w:val="4b4b4b"/>
+        </w:rPr>
+      </w:pPr>
+      <w:r>
+        <w:rPr>
+          <w:color w:val="4b4b4b"/>
+        </w:rPr>
+        <w:t xml:space="preserve">Para as próximas sprints, a equipe seguirá o cronograma definido, com foco n</w:t>
+      </w:r>
+      <w:r>
+        <w:rPr>
+          <w:color w:val="4b4b4b"/>
+        </w:rPr>
+        <w:t xml:space="preserve">o desenvolvimento da aplicação, na preparação da infraestrutura e, posteriormente, nos ajustes finais e no deploy em produção, mantendo como fio condutor o compromisso, a participação ativa e a melhoria contínua estabelecidos como boas práticas do projeto.</w:t>
+      </w:r>
+      <w:r>
+        <w:rPr>
+          <w:color w:val="4b4b4b"/>
+        </w:rPr>
+      </w:r>
+      <w:r>
+        <w:rPr>
+          <w:color w:val="4b4b4b"/>
+        </w:rPr>
+      </w:r>
+    </w:p>
+    <w:p>
+      <w:pPr>
+        <w:pBdr/>
+        <w:spacing/>
+        <w:ind/>
+        <w:rPr/>
+      </w:pPr>
+      <w:r/>
+      <w:r/>
+    </w:p>
+    <w:p>
+      <w:pPr>
+        <w:pStyle w:val="933"/>
+        <w:suppressLineNumbers w:val="false"/>
+        <w:pBdr>
+          <w:top w:val="none" w:color="000000" w:sz="4" w:space="0"/>
+          <w:left w:val="none" w:color="000000" w:sz="4" w:space="0"/>
+          <w:bottom w:val="single" w:color="0e2841" w:themeColor="text2" w:sz="4" w:space="0"/>
+          <w:right w:val="none" w:color="000000" w:sz="4" w:space="0"/>
+          <w:between w:val="none" w:color="000000" w:sz="4" w:space="0"/>
+        </w:pBdr>
+        <w:spacing w:line="276" w:lineRule="auto"/>
+        <w:ind/>
+        <w:rPr>
+          <w:color w:val="0e2841" w:themeColor="text2"/>
+        </w:rPr>
+      </w:pPr>
+      <w:r>
+        <w:rPr>
+          <w:color w:val="0e2841" w:themeColor="text2"/>
+        </w:rPr>
+        <w:t xml:space="preserve">12. Referências Bibliográficas</w:t>
       </w:r>
       <w:r>
         <w:rPr>
@@ -3616,7 +3995,7 @@
           <w:szCs w:val="22"/>
         </w:rPr>
       </w:r>
-      <w:hyperlink r:id="rId11" w:tooltip="https://www.reddit.com/r/InternetBrasil/comments/1uhlfpb/caz%C3%A9tv_travando_youtube_vivofibra_horario_de_pico/?utm_source=chatgpt.com" w:history="1">
+      <w:hyperlink r:id="rId12" w:tooltip="https://www.reddit.com/r/InternetBrasil/comments/1uhlfpb/caz%C3%A9tv_travando_youtube_vivofibra_horario_de_pico/" w:history="1">
         <w:r>
           <w:rPr>
             <w:rStyle w:val="945"/>
@@ -3664,7 +4043,7 @@
           <w:szCs w:val="22"/>
         </w:rPr>
       </w:r>
-      <w:hyperlink r:id="rId12" w:tooltip="https://www.reddit.com/r/InternetBrasil/comments/1uiy6t9/youtube_n%C3%A3o_aguenta_a_caz%C3%A9tv_em_jogos_do_brasil/?utm_source=chatgpt.com" w:history="1">
+      <w:hyperlink r:id="rId13" w:tooltip="https://www.reddit.com/r/InternetBrasil/comments/1uiy6t9/youtube_n%C3%A3o_aguenta_a_caz%C3%A9tv_em_jogos_do_brasil/" w:history="1">
         <w:r>
           <w:rPr>
             <w:rStyle w:val="945"/>
@@ -3712,7 +4091,7 @@
           <w:szCs w:val="22"/>
         </w:rPr>
       </w:r>
-      <w:hyperlink r:id="rId13" w:tooltip="https://cloud.google.com/blog/products/networking/live-streaming-with-media-cdn-and-google-cloud-load-balancer/?utm_source=chatgpt.com" w:history="1">
+      <w:hyperlink r:id="rId14" w:tooltip="https://cloud.google.com/blog/products/networking/live-streaming-with-media-cdn-and-google-cloud-load-balancer/" w:history="1">
         <w:r>
           <w:rPr>
             <w:rStyle w:val="945"/>
@@ -3760,7 +4139,7 @@
           <w:szCs w:val="22"/>
         </w:rPr>
       </w:r>
-      <w:hyperlink r:id="rId14" w:tooltip="https://blog.youtube/intl/pt-br/news-and-events/como-o-brasil-fez-historia-no-youtube-durante-a-copa-do-mundo-da-fifa-2026/?utm_source=chatgpt.com" w:history="1">
+      <w:hyperlink r:id="rId15" w:tooltip="https://blog.youtube/intl/pt-br/news-and-events/como-o-brasil-fez-historia-no-youtube-durante-a-copa-do-mundo-da-fifa-2026/" w:history="1">
         <w:r>
           <w:rPr>
             <w:rStyle w:val="945"/>
@@ -3808,7 +4187,7 @@
           <w:szCs w:val="22"/>
         </w:rPr>
       </w:r>
-      <w:hyperlink r:id="rId15" w:tooltip="https://www.appsflyer.com/pt/resources/reports/global-soccer-marketing-report/?utm_source=chatgpt.com" w:history="1">
+      <w:hyperlink r:id="rId16" w:tooltip="https://www.appsflyer.com/pt/resources/reports/global-soccer-marketing-report/" w:history="1">
         <w:r>
           <w:rPr>
             <w:rStyle w:val="945"/>
@@ -3856,7 +4235,7 @@
           <w:szCs w:val="22"/>
         </w:rPr>
       </w:r>
-      <w:hyperlink r:id="rId16" w:tooltip="https://www.tutor.do/noticia/47-dos-consumidores-cancelaram-a-assinatura-de-um-servico-de-streaming-devido-a-problemas-de-buffering?utm_source=chatgpt.com" w:history="1">
+      <w:hyperlink r:id="rId17" w:tooltip="https://www.tutor.do/noticia/47-dos-consumidores-cancelaram-a-assinatura-de-um-servico-de-streaming-devido-a-problemas-de-buffering" w:history="1">
         <w:r>
           <w:rPr>
             <w:rStyle w:val="945"/>
@@ -3904,7 +4283,7 @@
           <w:szCs w:val="22"/>
         </w:rPr>
       </w:r>
-      <w:hyperlink r:id="rId17" w:tooltip="https://tecflow.com.br/2026/06/16/downtime-custa-600-bilhoes-ataques-ciberneticos/?utm_source=chatgpt.com" w:history="1">
+      <w:hyperlink r:id="rId18" w:tooltip="https://tecflow.com.br/2026/06/16/downtime-custa-600-bilhoes-ataques-ciberneticos/" w:history="1">
         <w:r>
           <w:rPr>
             <w:rStyle w:val="945"/>

</xml_diff>